<commit_message>
16/9 Signature + Editor file upload fix.
</commit_message>
<xml_diff>
--- a/apps/incidents/report_templates/report_template_v2.docx
+++ b/apps/incidents/report_templates/report_template_v2.docx
@@ -1531,7 +1531,7 @@
           </w:tcPr>
           <w:p>
             <w:pPr>
-              <w:spacing w:after="0" w:before="0"/>
+              <w:spacing w:after="0" w:before="0" w:line="440" w:lineRule="exact"/>
             </w:pPr>
             <w:r>
               <w:rPr>
@@ -2786,7 +2786,7 @@
           </w:tcPr>
           <w:p>
             <w:pPr>
-              <w:spacing w:after="0" w:before="0"/>
+              <w:spacing w:after="0" w:before="0" w:line="440" w:lineRule="exact"/>
             </w:pPr>
             <w:r>
               <w:rPr>
@@ -2887,7 +2887,7 @@
           </w:tcPr>
           <w:p>
             <w:pPr>
-              <w:spacing w:after="0" w:before="0"/>
+              <w:spacing w:after="0" w:before="0" w:line="440" w:lineRule="exact"/>
             </w:pPr>
             <w:r>
               <w:rPr>
@@ -2988,7 +2988,7 @@
           </w:tcPr>
           <w:p>
             <w:pPr>
-              <w:spacing w:after="0" w:before="0"/>
+              <w:spacing w:after="0" w:before="0" w:line="440" w:lineRule="exact"/>
             </w:pPr>
             <w:r>
               <w:rPr>
@@ -3007,6 +3007,188 @@
       <w:pPr>
         <w:spacing w:after="0"/>
       </w:pPr>
+    </w:p>
+    <w:p>
+      <w:pPr>
+        <w:spacing w:after="80"/>
+      </w:pPr>
+    </w:p>
+    <w:tbl>
+      <w:tblPr>
+        <w:tblW w:type="auto" w:w="0"/>
+        <w:jc w:val="center"/>
+        <w:tblLayout w:type="fixed"/>
+        <w:tblLook w:firstColumn="1" w:firstRow="1" w:lastColumn="0" w:lastRow="0" w:noHBand="0" w:noVBand="1" w:val="04A0"/>
+        <w:tblBorders>
+          <w:top w:val="none"/>
+          <w:left w:val="none"/>
+          <w:bottom w:val="none"/>
+          <w:right w:val="none"/>
+          <w:insideH w:val="none"/>
+          <w:insideV w:val="none"/>
+        </w:tblBorders>
+      </w:tblPr>
+      <w:tblGrid>
+        <w:gridCol w:w="4752"/>
+        <w:gridCol w:w="4752"/>
+      </w:tblGrid>
+      <w:tr>
+        <w:trPr>
+          <w:cantSplit/>
+        </w:trPr>
+        <w:tc>
+          <w:tcPr>
+            <w:tcW w:type="dxa" w:w="4752"/>
+            <w:vAlign w:val="center"/>
+            <w:tcMar>
+              <w:top w:w="20" w:type="dxa"/>
+              <w:start w:w="120" w:type="dxa"/>
+              <w:bottom w:w="20" w:type="dxa"/>
+              <w:end w:w="120" w:type="dxa"/>
+            </w:tcMar>
+          </w:tcPr>
+          <w:p>
+            <w:pPr>
+              <w:spacing w:after="0" w:before="0"/>
+              <w:jc w:val="center"/>
+            </w:pPr>
+            <w:r>
+              <w:rPr>
+                <w:rFonts w:ascii="TH Sarabun New" w:hAnsi="TH Sarabun New" w:cs="TH Sarabun New"/>
+                <w:b w:val="0"/>
+                <w:color w:val="404040"/>
+                <w:sz w:val="32"/>
+              </w:rPr>
+              <w:t>..........................................</w:t>
+            </w:r>
+          </w:p>
+          <w:p>
+            <w:pPr>
+              <w:spacing w:after="0"/>
+              <w:jc w:val="center"/>
+            </w:pPr>
+            <w:r>
+              <w:rPr>
+                <w:rFonts w:ascii="TH Sarabun New" w:hAnsi="TH Sarabun New" w:cs="TH Sarabun New"/>
+                <w:b w:val="0"/>
+                <w:color w:val="404040"/>
+                <w:sz w:val="32"/>
+              </w:rPr>
+              <w:t>{{signoff_reporter}}</w:t>
+            </w:r>
+          </w:p>
+          <w:p>
+            <w:pPr>
+              <w:spacing w:after="0"/>
+              <w:jc w:val="center"/>
+            </w:pPr>
+            <w:r>
+              <w:rPr>
+                <w:rFonts w:ascii="TH Sarabun New" w:hAnsi="TH Sarabun New" w:cs="TH Sarabun New"/>
+                <w:b w:val="0"/>
+                <w:color w:val="404040"/>
+                <w:sz w:val="32"/>
+              </w:rPr>
+              <w:t>( ผู้รายงานเหตุการณ์ )</w:t>
+            </w:r>
+          </w:p>
+          <w:p>
+            <w:pPr>
+              <w:spacing w:after="0"/>
+              <w:jc w:val="center"/>
+            </w:pPr>
+            <w:r>
+              <w:rPr>
+                <w:rFonts w:ascii="TH Sarabun New" w:hAnsi="TH Sarabun New" w:cs="TH Sarabun New"/>
+                <w:b w:val="0"/>
+                <w:color w:val="404040"/>
+                <w:sz w:val="32"/>
+              </w:rPr>
+              <w:t>วันที่ .......... / .......... / ..........</w:t>
+            </w:r>
+          </w:p>
+        </w:tc>
+        <w:tc>
+          <w:tcPr>
+            <w:tcW w:type="dxa" w:w="4752"/>
+            <w:vAlign w:val="center"/>
+            <w:tcMar>
+              <w:top w:w="20" w:type="dxa"/>
+              <w:start w:w="120" w:type="dxa"/>
+              <w:bottom w:w="20" w:type="dxa"/>
+              <w:end w:w="120" w:type="dxa"/>
+            </w:tcMar>
+          </w:tcPr>
+          <w:p>
+            <w:pPr>
+              <w:spacing w:after="0" w:before="0"/>
+              <w:jc w:val="center"/>
+            </w:pPr>
+            <w:r>
+              <w:rPr>
+                <w:rFonts w:ascii="TH Sarabun New" w:hAnsi="TH Sarabun New" w:cs="TH Sarabun New"/>
+                <w:b w:val="0"/>
+                <w:color w:val="404040"/>
+                <w:sz w:val="32"/>
+              </w:rPr>
+              <w:t>..........................................</w:t>
+            </w:r>
+          </w:p>
+          <w:p>
+            <w:pPr>
+              <w:spacing w:after="0"/>
+              <w:jc w:val="center"/>
+            </w:pPr>
+            <w:r>
+              <w:rPr>
+                <w:rFonts w:ascii="TH Sarabun New" w:hAnsi="TH Sarabun New" w:cs="TH Sarabun New"/>
+                <w:b w:val="0"/>
+                <w:color w:val="404040"/>
+                <w:sz w:val="32"/>
+              </w:rPr>
+              <w:t>{{signoff_approver}}</w:t>
+            </w:r>
+          </w:p>
+          <w:p>
+            <w:pPr>
+              <w:spacing w:after="0"/>
+              <w:jc w:val="center"/>
+            </w:pPr>
+            <w:r>
+              <w:rPr>
+                <w:rFonts w:ascii="TH Sarabun New" w:hAnsi="TH Sarabun New" w:cs="TH Sarabun New"/>
+                <w:b w:val="0"/>
+                <w:color w:val="404040"/>
+                <w:sz w:val="32"/>
+              </w:rPr>
+              <w:t>( ผู้อนุมัติ )</w:t>
+            </w:r>
+          </w:p>
+          <w:p>
+            <w:pPr>
+              <w:spacing w:after="0"/>
+              <w:jc w:val="center"/>
+            </w:pPr>
+            <w:r>
+              <w:rPr>
+                <w:rFonts w:ascii="TH Sarabun New" w:hAnsi="TH Sarabun New" w:cs="TH Sarabun New"/>
+                <w:b w:val="0"/>
+                <w:color w:val="404040"/>
+                <w:sz w:val="32"/>
+              </w:rPr>
+              <w:t>วันที่ .......... / .......... / ..........</w:t>
+            </w:r>
+          </w:p>
+        </w:tc>
+      </w:tr>
+    </w:tbl>
+    <w:p>
+      <w:pPr>
+        <w:spacing w:after="0"/>
+      </w:pPr>
+      <w:r>
+        <w:br w:type="page"/>
+      </w:r>
     </w:p>
     <w:tbl>
       <w:tblPr>
@@ -3089,7 +3271,7 @@
           </w:tcPr>
           <w:p>
             <w:pPr>
-              <w:spacing w:after="0" w:before="0"/>
+              <w:spacing w:after="0" w:before="0" w:line="440" w:lineRule="exact"/>
             </w:pPr>
             <w:r>
               <w:rPr>
@@ -3111,6 +3293,9 @@
             </w:r>
           </w:p>
           <w:p>
+            <w:pPr>
+              <w:spacing w:line="440" w:lineRule="exact" w:before="0" w:after="0"/>
+            </w:pPr>
             <w:r>
               <w:rPr>
                 <w:rFonts w:ascii="DejaVu Sans" w:hAnsi="DejaVu Sans" w:cs="DejaVu Sans"/>
@@ -3131,6 +3316,9 @@
             </w:r>
           </w:p>
           <w:p>
+            <w:pPr>
+              <w:spacing w:line="440" w:lineRule="exact" w:before="0" w:after="0"/>
+            </w:pPr>
             <w:r>
               <w:rPr>
                 <w:rFonts w:ascii="DejaVu Sans" w:hAnsi="DejaVu Sans" w:cs="DejaVu Sans"/>
@@ -3151,6 +3339,9 @@
             </w:r>
           </w:p>
           <w:p>
+            <w:pPr>
+              <w:spacing w:line="440" w:lineRule="exact" w:before="0" w:after="0"/>
+            </w:pPr>
             <w:r>
               <w:rPr>
                 <w:rFonts w:ascii="DejaVu Sans" w:hAnsi="DejaVu Sans" w:cs="DejaVu Sans"/>
@@ -3171,6 +3362,9 @@
             </w:r>
           </w:p>
           <w:p>
+            <w:pPr>
+              <w:spacing w:line="440" w:lineRule="exact" w:before="0" w:after="0"/>
+            </w:pPr>
             <w:r>
               <w:rPr>
                 <w:rFonts w:ascii="DejaVu Sans" w:hAnsi="DejaVu Sans" w:cs="DejaVu Sans"/>
@@ -3191,6 +3385,9 @@
             </w:r>
           </w:p>
           <w:p>
+            <w:pPr>
+              <w:spacing w:line="440" w:lineRule="exact" w:before="0" w:after="0"/>
+            </w:pPr>
             <w:r>
               <w:rPr>
                 <w:rFonts w:ascii="DejaVu Sans" w:hAnsi="DejaVu Sans" w:cs="DejaVu Sans"/>
@@ -3211,6 +3408,9 @@
             </w:r>
           </w:p>
           <w:p>
+            <w:pPr>
+              <w:spacing w:line="440" w:lineRule="exact" w:before="0" w:after="0"/>
+            </w:pPr>
             <w:r>
               <w:rPr>
                 <w:rFonts w:ascii="DejaVu Sans" w:hAnsi="DejaVu Sans" w:cs="DejaVu Sans"/>
@@ -3231,6 +3431,9 @@
             </w:r>
           </w:p>
           <w:p>
+            <w:pPr>
+              <w:spacing w:line="440" w:lineRule="exact" w:before="0" w:after="0"/>
+            </w:pPr>
             <w:r>
               <w:rPr>
                 <w:rFonts w:ascii="DejaVu Sans" w:hAnsi="DejaVu Sans" w:cs="DejaVu Sans"/>
@@ -3251,6 +3454,9 @@
             </w:r>
           </w:p>
           <w:p>
+            <w:pPr>
+              <w:spacing w:line="440" w:lineRule="exact" w:before="0" w:after="0"/>
+            </w:pPr>
             <w:r>
               <w:rPr>
                 <w:rFonts w:ascii="DejaVu Sans" w:hAnsi="DejaVu Sans" w:cs="DejaVu Sans"/>
@@ -3271,6 +3477,9 @@
             </w:r>
           </w:p>
           <w:p>
+            <w:pPr>
+              <w:spacing w:line="440" w:lineRule="exact" w:before="0" w:after="0"/>
+            </w:pPr>
             <w:r>
               <w:rPr>
                 <w:rFonts w:ascii="DejaVu Sans" w:hAnsi="DejaVu Sans" w:cs="DejaVu Sans"/>
@@ -3291,6 +3500,9 @@
             </w:r>
           </w:p>
           <w:p>
+            <w:pPr>
+              <w:spacing w:line="440" w:lineRule="exact" w:before="0" w:after="0"/>
+            </w:pPr>
             <w:r>
               <w:rPr>
                 <w:rFonts w:ascii="DejaVu Sans" w:hAnsi="DejaVu Sans" w:cs="DejaVu Sans"/>
@@ -3311,6 +3523,9 @@
             </w:r>
           </w:p>
           <w:p>
+            <w:pPr>
+              <w:spacing w:line="440" w:lineRule="exact" w:before="0" w:after="0"/>
+            </w:pPr>
             <w:r>
               <w:rPr>
                 <w:rFonts w:ascii="DejaVu Sans" w:hAnsi="DejaVu Sans" w:cs="DejaVu Sans"/>
@@ -3331,6 +3546,9 @@
             </w:r>
           </w:p>
           <w:p>
+            <w:pPr>
+              <w:spacing w:line="440" w:lineRule="exact" w:before="0" w:after="0"/>
+            </w:pPr>
             <w:r>
               <w:rPr>
                 <w:rFonts w:ascii="DejaVu Sans" w:hAnsi="DejaVu Sans" w:cs="DejaVu Sans"/>
@@ -3351,6 +3569,9 @@
             </w:r>
           </w:p>
           <w:p>
+            <w:pPr>
+              <w:spacing w:line="440" w:lineRule="exact" w:before="0" w:after="0"/>
+            </w:pPr>
             <w:r>
               <w:rPr>
                 <w:rFonts w:ascii="DejaVu Sans" w:hAnsi="DejaVu Sans" w:cs="DejaVu Sans"/>
@@ -3371,6 +3592,9 @@
             </w:r>
           </w:p>
           <w:p>
+            <w:pPr>
+              <w:spacing w:line="440" w:lineRule="exact" w:before="0" w:after="0"/>
+            </w:pPr>
             <w:r>
               <w:rPr>
                 <w:rFonts w:ascii="DejaVu Sans" w:hAnsi="DejaVu Sans" w:cs="DejaVu Sans"/>
@@ -3391,6 +3615,9 @@
             </w:r>
           </w:p>
           <w:p>
+            <w:pPr>
+              <w:spacing w:line="440" w:lineRule="exact" w:before="0" w:after="0"/>
+            </w:pPr>
             <w:r>
               <w:rPr>
                 <w:rFonts w:ascii="DejaVu Sans" w:hAnsi="DejaVu Sans" w:cs="DejaVu Sans"/>
@@ -3411,6 +3638,9 @@
             </w:r>
           </w:p>
           <w:p>
+            <w:pPr>
+              <w:spacing w:line="440" w:lineRule="exact" w:before="0" w:after="0"/>
+            </w:pPr>
             <w:r>
               <w:rPr>
                 <w:rFonts w:ascii="TH Sarabun New" w:hAnsi="TH Sarabun New" w:cs="TH Sarabun New"/>
@@ -3422,6 +3652,9 @@
             </w:r>
           </w:p>
           <w:p>
+            <w:pPr>
+              <w:spacing w:line="440" w:lineRule="exact" w:before="0" w:after="0"/>
+            </w:pPr>
             <w:r>
               <w:rPr>
                 <w:rFonts w:ascii="TH Sarabun New" w:hAnsi="TH Sarabun New" w:cs="TH Sarabun New"/>
@@ -3433,6 +3666,9 @@
             </w:r>
           </w:p>
           <w:p>
+            <w:pPr>
+              <w:spacing w:line="440" w:lineRule="exact" w:before="0" w:after="0"/>
+            </w:pPr>
             <w:r>
               <w:rPr>
                 <w:rFonts w:ascii="TH Sarabun New" w:hAnsi="TH Sarabun New" w:cs="TH Sarabun New"/>
@@ -3444,6 +3680,9 @@
             </w:r>
           </w:p>
           <w:p>
+            <w:pPr>
+              <w:spacing w:line="440" w:lineRule="exact" w:before="0" w:after="0"/>
+            </w:pPr>
             <w:r>
               <w:rPr>
                 <w:rFonts w:ascii="TH Sarabun New" w:hAnsi="TH Sarabun New" w:cs="TH Sarabun New"/>

</xml_diff>

<commit_message>
17/9 Notified Date Field.
</commit_message>
<xml_diff>
--- a/apps/incidents/report_templates/report_template_v2.docx
+++ b/apps/incidents/report_templates/report_template_v2.docx
@@ -328,7 +328,62 @@
                 <w:color w:val="404040"/>
                 <w:sz w:val="32"/>
               </w:rPr>
-              <w:t>1.4 ชื่อ incident/event</w:t>
+              <w:t>1.4 วันที่ เวลา ที่แจ้งเหตุผู้ที่ได้รับผลกระทบ</w:t>
+            </w:r>
+          </w:p>
+        </w:tc>
+        <w:tc>
+          <w:tcPr>
+            <w:tcW w:type="dxa" w:w="6192"/>
+            <w:vAlign w:val="center"/>
+            <w:tcMar>
+              <w:top w:w="20" w:type="dxa"/>
+              <w:start w:w="120" w:type="dxa"/>
+              <w:bottom w:w="20" w:type="dxa"/>
+              <w:end w:w="120" w:type="dxa"/>
+            </w:tcMar>
+          </w:tcPr>
+          <w:p>
+            <w:pPr>
+              <w:spacing w:after="0" w:before="0"/>
+            </w:pPr>
+            <w:r>
+              <w:rPr>
+                <w:rFonts w:ascii="TH Sarabun New" w:hAnsi="TH Sarabun New" w:cs="TH Sarabun New"/>
+                <w:b w:val="0"/>
+                <w:color w:val="404040"/>
+                <w:sz w:val="32"/>
+              </w:rPr>
+              <w:t>{{affected_notified_at}}</w:t>
+            </w:r>
+          </w:p>
+        </w:tc>
+      </w:tr>
+      <w:tr>
+        <w:tc>
+          <w:tcPr>
+            <w:tcW w:type="dxa" w:w="3312"/>
+            <w:vAlign w:val="center"/>
+            <w:tcMar>
+              <w:top w:w="20" w:type="dxa"/>
+              <w:start w:w="120" w:type="dxa"/>
+              <w:bottom w:w="20" w:type="dxa"/>
+              <w:end w:w="120" w:type="dxa"/>
+            </w:tcMar>
+            <w:shd w:val="clear" w:fill="F2F2F2"/>
+          </w:tcPr>
+          <w:p>
+            <w:pPr>
+              <w:spacing w:after="0" w:before="0"/>
+            </w:pPr>
+            <w:r>
+              <w:rPr>
+                <w:rFonts w:ascii="TH Sarabun New" w:hAnsi="TH Sarabun New" w:cs="TH Sarabun New"/>
+                <w:b/>
+                <w:color w:val="404040"/>
+                <w:sz w:val="32"/>
+              </w:rPr>
+              <w:t>1.5 ชื่อ incident/event</w:t>
             </w:r>
           </w:p>
         </w:tc>
@@ -383,7 +438,7 @@
                 <w:color w:val="404040"/>
                 <w:sz w:val="32"/>
               </w:rPr>
-              <w:t>1.5 ประเภท: event หรือ incident</w:t>
+              <w:t>1.6 ประเภท: event หรือ incident</w:t>
             </w:r>
           </w:p>
         </w:tc>
@@ -474,7 +529,7 @@
                 <w:color w:val="404040"/>
                 <w:sz w:val="32"/>
               </w:rPr>
-              <w:t>1.6 ระดับความสำคัญ</w:t>
+              <w:t>1.7 ระดับความสำคัญ</w:t>
             </w:r>
           </w:p>
         </w:tc>
@@ -592,7 +647,7 @@
                 <w:color w:val="404040"/>
                 <w:sz w:val="32"/>
               </w:rPr>
-              <w:t>1.7 ระดับความรุนแรง (อ้างอิงตามระบบ SIEM)</w:t>
+              <w:t>1.8 ระดับความรุนแรง (อ้างอิงตามระบบ SIEM)</w:t>
             </w:r>
           </w:p>
         </w:tc>
@@ -737,7 +792,7 @@
                 <w:color w:val="404040"/>
                 <w:sz w:val="32"/>
               </w:rPr>
-              <w:t>1.8 ระดับความรุนแรง (อ้างอิงตาม สกมช.)</w:t>
+              <w:t>1.9 ระดับความรุนแรง (อ้างอิงตาม สกมช.)</w:t>
             </w:r>
           </w:p>
         </w:tc>
@@ -855,7 +910,7 @@
                 <w:color w:val="404040"/>
                 <w:sz w:val="32"/>
               </w:rPr>
-              <w:t>1.9 *หมวดหมู่ของภัยคุกคามทางไซเบอร์ (Category)</w:t>
+              <w:t>1.10 *หมวดหมู่ของภัยคุกคามทางไซเบอร์ (Category)</w:t>
             </w:r>
           </w:p>
         </w:tc>
@@ -910,7 +965,7 @@
                 <w:color w:val="404040"/>
                 <w:sz w:val="32"/>
               </w:rPr>
-              <w:t>1.10 ทรัพย์สินที่ได้รับผลกระทบ</w:t>
+              <w:t>1.11 ทรัพย์สินที่ได้รับผลกระทบ</w:t>
             </w:r>
           </w:p>
         </w:tc>
@@ -965,7 +1020,7 @@
                 <w:color w:val="404040"/>
                 <w:sz w:val="32"/>
               </w:rPr>
-              <w:t>1.11 ประเภททรัพย์สินที่ได้รับผลกระทบ</w:t>
+              <w:t>1.12 ประเภททรัพย์สินที่ได้รับผลกระทบ</w:t>
             </w:r>
           </w:p>
         </w:tc>
@@ -1083,7 +1138,7 @@
                 <w:color w:val="404040"/>
                 <w:sz w:val="32"/>
               </w:rPr>
-              <w:t>1.12 ส่วนงานเจ้าของหรือผู้ดูแลทรัพย์สิน</w:t>
+              <w:t>1.13 ส่วนงานเจ้าของหรือผู้ดูแลทรัพย์สิน</w:t>
             </w:r>
           </w:p>
         </w:tc>
@@ -1138,7 +1193,7 @@
                 <w:color w:val="404040"/>
                 <w:sz w:val="32"/>
               </w:rPr>
-              <w:t>1.13 รายละเอียด</w:t>
+              <w:t>1.14 รายละเอียด</w:t>
             </w:r>
           </w:p>
         </w:tc>
@@ -1193,7 +1248,7 @@
                 <w:color w:val="404040"/>
                 <w:sz w:val="32"/>
               </w:rPr>
-              <w:t>1.14 สถานะปัจจุบัน</w:t>
+              <w:t>1.15 สถานะปัจจุบัน</w:t>
             </w:r>
           </w:p>
         </w:tc>
@@ -1248,7 +1303,7 @@
                 <w:color w:val="404040"/>
                 <w:sz w:val="32"/>
               </w:rPr>
-              <w:t>1.15 เรื่องที่ดำเนินการแล้ว</w:t>
+              <w:t>1.16 เรื่องที่ดำเนินการแล้ว</w:t>
             </w:r>
           </w:p>
         </w:tc>
@@ -1303,7 +1358,7 @@
                 <w:color w:val="404040"/>
                 <w:sz w:val="32"/>
               </w:rPr>
-              <w:t>1.16 การที่จะดำเนินการลำดับถัดไป</w:t>
+              <w:t>1.17 การที่จะดำเนินการลำดับถัดไป</w:t>
             </w:r>
           </w:p>
         </w:tc>
@@ -1358,7 +1413,7 @@
                 <w:color w:val="404040"/>
                 <w:sz w:val="32"/>
               </w:rPr>
-              <w:t>1.17 ผู้รายงาน</w:t>
+              <w:t>1.18 ผู้รายงาน</w:t>
             </w:r>
           </w:p>
         </w:tc>
@@ -1413,7 +1468,7 @@
                 <w:color w:val="404040"/>
                 <w:sz w:val="32"/>
               </w:rPr>
-              <w:t>1.18 แหล่งข้อมูล</w:t>
+              <w:t>1.19 แหล่งข้อมูล</w:t>
             </w:r>
           </w:p>
         </w:tc>
@@ -4613,7 +4668,7 @@
               <w:color w:val="5B6775"/>
               <w:sz w:val="20"/>
             </w:rPr>
-            <w:t>INCIDENT REPORT CONTAINMENT แบบฟอร์มรายงานเหตุการณ์ผิดปกติ</w:t>
+            <w:t>INCIDENT REPORT CONTAINMENT แบบฟอร์มรายงานเหตุการณ์ผิดปกติ v3.4</w:t>
           </w:r>
         </w:p>
       </w:tc>

</xml_diff>